<commit_message>
fix(bast): lengkapi isian cetak BAST dan ambil perusahaan dari lokasi customer
</commit_message>
<xml_diff>
--- a/public/templates/template_bast.docx
+++ b/public/templates/template_bast.docx
@@ -1,6 +1,6 @@
 
 <file path=word/document.xml><?xml version="1.0" encoding="utf-8"?>
-<w:document xmlns:wpc="http://schemas.microsoft.com/office/word/2010/wordprocessingCanvas" xmlns:cx="http://schemas.microsoft.com/office/drawing/2014/chartex" xmlns:cx1="http://schemas.microsoft.com/office/drawing/2015/9/8/chartex" xmlns:cx2="http://schemas.microsoft.com/office/drawing/2015/10/21/chartex" xmlns:cx3="http://schemas.microsoft.com/office/drawing/2016/5/9/chartex" xmlns:cx4="http://schemas.microsoft.com/office/drawing/2016/5/10/chartex" xmlns:cx5="http://schemas.microsoft.com/office/drawing/2016/5/11/chartex" xmlns:cx6="http://schemas.microsoft.com/office/drawing/2016/5/12/chartex" xmlns:cx7="http://schemas.microsoft.com/office/drawing/2016/5/13/chartex" xmlns:cx8="http://schemas.microsoft.com/office/drawing/2016/5/14/chartex" xmlns:mc="http://schemas.openxmlformats.org/markup-compatibility/2006" xmlns:aink="http://schemas.microsoft.com/office/drawing/2016/ink" xmlns:am3d="http://schemas.microsoft.com/office/drawing/2017/model3d" xmlns:o="urn:schemas-microsoft-com:office:office" xmlns:r="http://schemas.openxmlformats.org/officeDocument/2006/relationships" xmlns:m="http://schemas.openxmlformats.org/officeDocument/2006/math" xmlns:v="urn:schemas-microsoft-com:vml" xmlns:wp14="http://schemas.microsoft.com/office/word/2010/wordprocessingDrawing" xmlns:wp="http://schemas.openxmlformats.org/drawingml/2006/wordprocessingDrawing" xmlns:w10="urn:schemas-microsoft-com:office:word" xmlns:w="http://schemas.openxmlformats.org/wordprocessingml/2006/main" xmlns:w14="http://schemas.microsoft.com/office/word/2010/wordml" xmlns:w15="http://schemas.microsoft.com/office/word/2012/wordml" xmlns:w16cex="http://schemas.microsoft.com/office/word/2018/wordml/cex" xmlns:w16cid="http://schemas.microsoft.com/office/word/2016/wordml/cid" xmlns:w16="http://schemas.microsoft.com/office/word/2018/wordml" xmlns:w16sdtdh="http://schemas.microsoft.com/office/word/2020/wordml/sdtdatahash" xmlns:w16se="http://schemas.microsoft.com/office/word/2015/wordml/symex" xmlns:wpg="http://schemas.microsoft.com/office/word/2010/wordprocessingGroup" xmlns:wpi="http://schemas.microsoft.com/office/word/2010/wordprocessingInk" xmlns:wne="http://schemas.microsoft.com/office/word/2006/wordml" xmlns:wps="http://schemas.microsoft.com/office/word/2010/wordprocessingShape" mc:Ignorable="w14 w15 w16se w16cid w16 w16cex w16sdtdh wp14">
+<w:document xmlns:wpc="http://schemas.microsoft.com/office/word/2010/wordprocessingCanvas" xmlns:cx="http://schemas.microsoft.com/office/drawing/2014/chartex" xmlns:cx1="http://schemas.microsoft.com/office/drawing/2015/9/8/chartex" xmlns:cx2="http://schemas.microsoft.com/office/drawing/2015/10/21/chartex" xmlns:cx3="http://schemas.microsoft.com/office/drawing/2016/5/9/chartex" xmlns:cx4="http://schemas.microsoft.com/office/drawing/2016/5/10/chartex" xmlns:cx5="http://schemas.microsoft.com/office/drawing/2016/5/11/chartex" xmlns:cx6="http://schemas.microsoft.com/office/drawing/2016/5/12/chartex" xmlns:cx7="http://schemas.microsoft.com/office/drawing/2016/5/13/chartex" xmlns:cx8="http://schemas.microsoft.com/office/drawing/2016/5/14/chartex" xmlns:mc="http://schemas.openxmlformats.org/markup-compatibility/2006" xmlns:aink="http://schemas.microsoft.com/office/drawing/2016/ink" xmlns:am3d="http://schemas.microsoft.com/office/drawing/2017/model3d" xmlns:o="urn:schemas-microsoft-com:office:office" xmlns:oel="http://schemas.microsoft.com/office/2019/extlst" xmlns:r="http://schemas.openxmlformats.org/officeDocument/2006/relationships" xmlns:m="http://schemas.openxmlformats.org/officeDocument/2006/math" xmlns:v="urn:schemas-microsoft-com:vml" xmlns:wp14="http://schemas.microsoft.com/office/word/2010/wordprocessingDrawing" xmlns:wp="http://schemas.openxmlformats.org/drawingml/2006/wordprocessingDrawing" xmlns:w10="urn:schemas-microsoft-com:office:word" xmlns:w="http://schemas.openxmlformats.org/wordprocessingml/2006/main" xmlns:w14="http://schemas.microsoft.com/office/word/2010/wordml" xmlns:w15="http://schemas.microsoft.com/office/word/2012/wordml" xmlns:w16cex="http://schemas.microsoft.com/office/word/2018/wordml/cex" xmlns:w16cid="http://schemas.microsoft.com/office/word/2016/wordml/cid" xmlns:w16="http://schemas.microsoft.com/office/word/2018/wordml" xmlns:w16sdtdh="http://schemas.microsoft.com/office/word/2020/wordml/sdtdatahash" xmlns:w16se="http://schemas.microsoft.com/office/word/2015/wordml/symex" xmlns:wpg="http://schemas.microsoft.com/office/word/2010/wordprocessingGroup" xmlns:wpi="http://schemas.microsoft.com/office/word/2010/wordprocessingInk" xmlns:wne="http://schemas.microsoft.com/office/word/2006/wordml" xmlns:wps="http://schemas.microsoft.com/office/word/2010/wordprocessingShape" mc:Ignorable="w14 w15 w16se w16cid w16 w16cex w16sdtdh wp14">
   <w:body>
     <w:p>
       <w:pPr>
@@ -28,7 +28,7 @@
         <w:rPr>
           <w:rFonts w:ascii="Times New Roman" w:eastAsia="Times New Roman" w:hAnsi="Times New Roman" w:cs="Times New Roman"/>
           <w:sz w:val="24"/>
-          <w:lang w:val="en-US"/>
+          <w:lang w:val="sv-SE"/>
         </w:rPr>
       </w:pPr>
       <w:r>
@@ -42,27 +42,9 @@
         <w:rPr>
           <w:rFonts w:ascii="Times New Roman" w:eastAsia="Times New Roman" w:hAnsi="Times New Roman" w:cs="Times New Roman"/>
           <w:sz w:val="24"/>
-          <w:lang w:val="en-US"/>
-        </w:rPr>
-        <w:t>${</w:t>
-      </w:r>
-      <w:proofErr w:type="spellStart"/>
-      <w:r>
-        <w:rPr>
-          <w:rFonts w:ascii="Times New Roman" w:eastAsia="Times New Roman" w:hAnsi="Times New Roman" w:cs="Times New Roman"/>
-          <w:sz w:val="24"/>
-          <w:lang w:val="en-US"/>
-        </w:rPr>
-        <w:t>no_bast</w:t>
-      </w:r>
-      <w:proofErr w:type="spellEnd"/>
-      <w:r>
-        <w:rPr>
-          <w:rFonts w:ascii="Times New Roman" w:eastAsia="Times New Roman" w:hAnsi="Times New Roman" w:cs="Times New Roman"/>
-          <w:sz w:val="24"/>
-          <w:lang w:val="en-US"/>
-        </w:rPr>
-        <w:t>}</w:t>
+          <w:lang w:val="sv-SE"/>
+        </w:rPr>
+        <w:t>${no_bast}</w:t>
       </w:r>
     </w:p>
     <w:p>
@@ -117,118 +99,45 @@
           <w:rFonts w:ascii="Times New Roman" w:eastAsia="Times New Roman" w:hAnsi="Times New Roman" w:cs="Times New Roman"/>
           <w:color w:val="000000" w:themeColor="text1"/>
           <w:sz w:val="24"/>
-          <w:lang w:val="en-US"/>
-        </w:rPr>
-        <w:t>${</w:t>
-      </w:r>
-      <w:proofErr w:type="spellStart"/>
+        </w:rPr>
+        <w:t xml:space="preserve">${hari_bast} </w:t>
+      </w:r>
+      <w:r>
+        <w:rPr>
+          <w:rFonts w:ascii="Times New Roman" w:eastAsia="Times New Roman" w:hAnsi="Times New Roman" w:cs="Times New Roman"/>
+          <w:sz w:val="24"/>
+        </w:rPr>
+        <w:t xml:space="preserve">tanggal </w:t>
+      </w:r>
       <w:r>
         <w:rPr>
           <w:rFonts w:ascii="Times New Roman" w:eastAsia="Times New Roman" w:hAnsi="Times New Roman" w:cs="Times New Roman"/>
           <w:color w:val="000000" w:themeColor="text1"/>
           <w:sz w:val="24"/>
-          <w:lang w:val="en-US"/>
-        </w:rPr>
-        <w:t>hari_bast</w:t>
-      </w:r>
-      <w:proofErr w:type="spellEnd"/>
+        </w:rPr>
+        <w:t>${tanggal}</w:t>
+      </w:r>
+      <w:r>
+        <w:rPr>
+          <w:rFonts w:ascii="Times New Roman" w:eastAsia="Times New Roman" w:hAnsi="Times New Roman" w:cs="Times New Roman"/>
+          <w:sz w:val="24"/>
+        </w:rPr>
+        <w:t xml:space="preserve"> </w:t>
+      </w:r>
+      <w:r>
+        <w:rPr>
+          <w:rFonts w:ascii="Times New Roman" w:eastAsia="Times New Roman" w:hAnsi="Times New Roman" w:cs="Times New Roman"/>
+          <w:sz w:val="24"/>
+        </w:rPr>
+        <w:t xml:space="preserve">bulan </w:t>
+      </w:r>
       <w:r>
         <w:rPr>
           <w:rFonts w:ascii="Times New Roman" w:eastAsia="Times New Roman" w:hAnsi="Times New Roman" w:cs="Times New Roman"/>
           <w:color w:val="000000" w:themeColor="text1"/>
           <w:sz w:val="24"/>
-          <w:lang w:val="en-US"/>
-        </w:rPr>
-        <w:t>}</w:t>
-      </w:r>
-      <w:r>
-        <w:rPr>
-          <w:rFonts w:ascii="Times New Roman" w:eastAsia="Times New Roman" w:hAnsi="Times New Roman" w:cs="Times New Roman"/>
-          <w:color w:val="000000" w:themeColor="text1"/>
-          <w:sz w:val="24"/>
-          <w:lang w:val="en-US"/>
-        </w:rPr>
-        <w:t xml:space="preserve"> </w:t>
-      </w:r>
-      <w:r>
-        <w:rPr>
-          <w:rFonts w:ascii="Times New Roman" w:eastAsia="Times New Roman" w:hAnsi="Times New Roman" w:cs="Times New Roman"/>
-          <w:sz w:val="24"/>
-        </w:rPr>
-        <w:t xml:space="preserve">tanggal </w:t>
-      </w:r>
-      <w:r>
-        <w:rPr>
-          <w:rFonts w:ascii="Times New Roman" w:eastAsia="Times New Roman" w:hAnsi="Times New Roman" w:cs="Times New Roman"/>
-          <w:color w:val="000000" w:themeColor="text1"/>
-          <w:sz w:val="24"/>
-          <w:lang w:val="en-US"/>
-        </w:rPr>
-        <w:t>${</w:t>
-      </w:r>
-      <w:proofErr w:type="spellStart"/>
-      <w:r>
-        <w:rPr>
-          <w:rFonts w:ascii="Times New Roman" w:eastAsia="Times New Roman" w:hAnsi="Times New Roman" w:cs="Times New Roman"/>
-          <w:color w:val="000000" w:themeColor="text1"/>
-          <w:sz w:val="24"/>
-          <w:lang w:val="en-US"/>
-        </w:rPr>
-        <w:t>tanggal</w:t>
-      </w:r>
-      <w:proofErr w:type="spellEnd"/>
-      <w:r>
-        <w:rPr>
-          <w:rFonts w:ascii="Times New Roman" w:eastAsia="Times New Roman" w:hAnsi="Times New Roman" w:cs="Times New Roman"/>
-          <w:color w:val="000000" w:themeColor="text1"/>
-          <w:sz w:val="24"/>
-          <w:lang w:val="en-US"/>
-        </w:rPr>
-        <w:t>}</w:t>
-      </w:r>
-      <w:r>
-        <w:rPr>
-          <w:rFonts w:ascii="Times New Roman" w:eastAsia="Times New Roman" w:hAnsi="Times New Roman" w:cs="Times New Roman"/>
-          <w:sz w:val="24"/>
-          <w:lang w:val="en-US"/>
-        </w:rPr>
-        <w:t xml:space="preserve"> </w:t>
-      </w:r>
-      <w:r>
-        <w:rPr>
-          <w:rFonts w:ascii="Times New Roman" w:eastAsia="Times New Roman" w:hAnsi="Times New Roman" w:cs="Times New Roman"/>
-          <w:sz w:val="24"/>
-        </w:rPr>
-        <w:t xml:space="preserve">bulan </w:t>
-      </w:r>
-      <w:r>
-        <w:rPr>
-          <w:rFonts w:ascii="Times New Roman" w:eastAsia="Times New Roman" w:hAnsi="Times New Roman" w:cs="Times New Roman"/>
-          <w:color w:val="000000" w:themeColor="text1"/>
-          <w:sz w:val="24"/>
-          <w:lang w:val="en-US"/>
-        </w:rPr>
-        <w:t>${</w:t>
-      </w:r>
-      <w:proofErr w:type="spellStart"/>
-      <w:r>
-        <w:rPr>
-          <w:rFonts w:ascii="Times New Roman" w:eastAsia="Times New Roman" w:hAnsi="Times New Roman" w:cs="Times New Roman"/>
-          <w:color w:val="000000" w:themeColor="text1"/>
-          <w:sz w:val="24"/>
-          <w:lang w:val="en-US"/>
-        </w:rPr>
-        <w:t>bulan</w:t>
-      </w:r>
-      <w:proofErr w:type="spellEnd"/>
-      <w:r>
-        <w:rPr>
-          <w:rFonts w:ascii="Times New Roman" w:eastAsia="Times New Roman" w:hAnsi="Times New Roman" w:cs="Times New Roman"/>
-          <w:color w:val="000000" w:themeColor="text1"/>
-          <w:sz w:val="24"/>
-          <w:lang w:val="en-US"/>
-        </w:rPr>
-        <w:t>}</w:t>
+        </w:rPr>
+        <w:t>${bulan}</w:t>
       </w:r>
       <w:r>
         <w:rPr>
@@ -241,33 +150,20 @@
         <w:rPr>
           <w:rFonts w:ascii="Times New Roman" w:eastAsia="Times New Roman" w:hAnsi="Times New Roman" w:cs="Times New Roman"/>
           <w:sz w:val="24"/>
-          <w:lang w:val="en-US"/>
-        </w:rPr>
-        <w:t>${</w:t>
-      </w:r>
-      <w:proofErr w:type="spellStart"/>
-      <w:r>
-        <w:rPr>
-          <w:rFonts w:ascii="Times New Roman" w:eastAsia="Times New Roman" w:hAnsi="Times New Roman" w:cs="Times New Roman"/>
-          <w:sz w:val="24"/>
-          <w:lang w:val="en-US"/>
-        </w:rPr>
-        <w:t>tahun</w:t>
-      </w:r>
-      <w:r>
-        <w:rPr>
-          <w:rFonts w:ascii="Times New Roman" w:eastAsia="Times New Roman" w:hAnsi="Times New Roman" w:cs="Times New Roman"/>
-          <w:sz w:val="24"/>
-          <w:lang w:val="en-US"/>
+        </w:rPr>
+        <w:t>${tahun</w:t>
+      </w:r>
+      <w:r>
+        <w:rPr>
+          <w:rFonts w:ascii="Times New Roman" w:eastAsia="Times New Roman" w:hAnsi="Times New Roman" w:cs="Times New Roman"/>
+          <w:sz w:val="24"/>
         </w:rPr>
         <w:t>_terbilang</w:t>
       </w:r>
-      <w:proofErr w:type="spellEnd"/>
-      <w:r>
-        <w:rPr>
-          <w:rFonts w:ascii="Times New Roman" w:eastAsia="Times New Roman" w:hAnsi="Times New Roman" w:cs="Times New Roman"/>
-          <w:sz w:val="24"/>
-          <w:lang w:val="en-US"/>
+      <w:r>
+        <w:rPr>
+          <w:rFonts w:ascii="Times New Roman" w:eastAsia="Times New Roman" w:hAnsi="Times New Roman" w:cs="Times New Roman"/>
+          <w:sz w:val="24"/>
         </w:rPr>
         <w:t>}</w:t>
       </w:r>
@@ -308,7 +204,7 @@
           <w:b/>
           <w:bCs/>
           <w:sz w:val="24"/>
-          <w:lang w:val="en-US"/>
+          <w:lang w:val="sv-SE"/>
         </w:rPr>
       </w:pPr>
       <w:r>
@@ -333,40 +229,16 @@
         </w:rPr>
         <w:tab/>
       </w:r>
-      <w:proofErr w:type="spellStart"/>
       <w:r>
         <w:rPr>
           <w:rFonts w:ascii="Times New Roman" w:eastAsia="Times New Roman" w:hAnsi="Times New Roman" w:cs="Times New Roman"/>
           <w:b/>
           <w:bCs/>
           <w:sz w:val="24"/>
-          <w:lang w:val="en-US"/>
-        </w:rPr>
-        <w:t>Beby</w:t>
-      </w:r>
-      <w:proofErr w:type="spellEnd"/>
-      <w:r>
-        <w:rPr>
-          <w:rFonts w:ascii="Times New Roman" w:eastAsia="Times New Roman" w:hAnsi="Times New Roman" w:cs="Times New Roman"/>
-          <w:b/>
-          <w:bCs/>
-          <w:sz w:val="24"/>
-          <w:lang w:val="en-US"/>
-        </w:rPr>
-        <w:t xml:space="preserve"> </w:t>
-      </w:r>
-      <w:proofErr w:type="spellStart"/>
-      <w:r>
-        <w:rPr>
-          <w:rFonts w:ascii="Times New Roman" w:eastAsia="Times New Roman" w:hAnsi="Times New Roman" w:cs="Times New Roman"/>
-          <w:b/>
-          <w:bCs/>
-          <w:sz w:val="24"/>
-          <w:lang w:val="en-US"/>
-        </w:rPr>
-        <w:t>Fitria</w:t>
-      </w:r>
-      <w:proofErr w:type="spellEnd"/>
+          <w:lang w:val="sv-SE"/>
+        </w:rPr>
+        <w:t>Beby Fitria</w:t>
+      </w:r>
     </w:p>
     <w:p>
       <w:pPr>
@@ -379,7 +251,6 @@
         <w:rPr>
           <w:rFonts w:ascii="Times New Roman" w:eastAsia="Times New Roman" w:hAnsi="Times New Roman" w:cs="Times New Roman"/>
           <w:sz w:val="24"/>
-          <w:lang w:val="en-US"/>
         </w:rPr>
       </w:pPr>
       <w:r>
@@ -408,7 +279,7 @@
         <w:rPr>
           <w:rFonts w:ascii="Times New Roman" w:eastAsia="Times New Roman" w:hAnsi="Times New Roman" w:cs="Times New Roman"/>
           <w:sz w:val="24"/>
-          <w:lang w:val="en-US"/>
+          <w:lang w:val="sv-SE"/>
         </w:rPr>
         <w:t>Admin</w:t>
       </w:r>
@@ -417,15 +288,14 @@
           <w:rFonts w:ascii="Times New Roman" w:eastAsia="Times New Roman" w:hAnsi="Times New Roman" w:cs="Times New Roman"/>
           <w:sz w:val="24"/>
         </w:rPr>
-        <w:t xml:space="preserve"> Marketing di PT. </w:t>
-      </w:r>
-      <w:r>
-        <w:rPr>
-          <w:rFonts w:ascii="Times New Roman" w:eastAsia="Times New Roman" w:hAnsi="Times New Roman" w:cs="Times New Roman"/>
-          <w:sz w:val="24"/>
-          <w:lang w:val="en-US"/>
-        </w:rPr>
-        <w:t>ALAM INDAH SELALU</w:t>
+        <w:t xml:space="preserve"> Marketing di </w:t>
+      </w:r>
+      <w:r>
+        <w:rPr>
+          <w:rFonts w:ascii="Times New Roman" w:eastAsia="Times New Roman" w:hAnsi="Times New Roman" w:cs="Times New Roman"/>
+          <w:sz w:val="24"/>
+        </w:rPr>
+        <w:t>${nama_perusahaan}</w:t>
       </w:r>
     </w:p>
     <w:p>
@@ -519,29 +389,8 @@
           <w:rFonts w:ascii="Times New Roman" w:hAnsi="Times New Roman"/>
           <w:b/>
           <w:szCs w:val="20"/>
-          <w:lang w:val="en-US"/>
-        </w:rPr>
-        <w:t>${</w:t>
-      </w:r>
-      <w:proofErr w:type="spellStart"/>
-      <w:r>
-        <w:rPr>
-          <w:rFonts w:ascii="Times New Roman" w:hAnsi="Times New Roman"/>
-          <w:b/>
-          <w:szCs w:val="20"/>
-          <w:lang w:val="en-US"/>
-        </w:rPr>
-        <w:t>nama_customer</w:t>
-      </w:r>
-      <w:proofErr w:type="spellEnd"/>
-      <w:r>
-        <w:rPr>
-          <w:rFonts w:ascii="Times New Roman" w:hAnsi="Times New Roman"/>
-          <w:b/>
-          <w:szCs w:val="20"/>
-          <w:lang w:val="en-US"/>
-        </w:rPr>
-        <w:t>}</w:t>
+        </w:rPr>
+        <w:t>${nama_customer}</w:t>
       </w:r>
     </w:p>
     <w:p>
@@ -576,7 +425,6 @@
         <w:rPr>
           <w:rFonts w:ascii="Times New Roman" w:eastAsia="Times New Roman" w:hAnsi="Times New Roman" w:cs="Times New Roman"/>
           <w:sz w:val="24"/>
-          <w:lang w:val="en-US"/>
         </w:rPr>
         <w:t xml:space="preserve"> </w:t>
       </w:r>
@@ -584,7 +432,6 @@
         <w:rPr>
           <w:rFonts w:ascii="Times New Roman" w:eastAsia="Times New Roman" w:hAnsi="Times New Roman" w:cs="Times New Roman"/>
           <w:sz w:val="24"/>
-          <w:lang w:val="en-US"/>
         </w:rPr>
         <w:tab/>
       </w:r>
@@ -592,27 +439,8 @@
         <w:rPr>
           <w:rFonts w:ascii="Times New Roman" w:hAnsi="Times New Roman"/>
           <w:szCs w:val="20"/>
-          <w:lang w:val="en-US"/>
-        </w:rPr>
-        <w:t>${</w:t>
-      </w:r>
-      <w:proofErr w:type="spellStart"/>
-      <w:r>
-        <w:rPr>
-          <w:rFonts w:ascii="Times New Roman" w:hAnsi="Times New Roman"/>
-          <w:szCs w:val="20"/>
-          <w:lang w:val="en-US"/>
-        </w:rPr>
-        <w:t>pekerjaan_cust</w:t>
-      </w:r>
-      <w:proofErr w:type="spellEnd"/>
-      <w:r>
-        <w:rPr>
-          <w:rFonts w:ascii="Times New Roman" w:hAnsi="Times New Roman"/>
-          <w:szCs w:val="20"/>
-          <w:lang w:val="en-US"/>
-        </w:rPr>
-        <w:t>}</w:t>
+        </w:rPr>
+        <w:t>${pekerjaan_cust}</w:t>
       </w:r>
       <w:r>
         <w:rPr>
@@ -654,7 +482,6 @@
         <w:rPr>
           <w:rFonts w:ascii="Times New Roman" w:eastAsia="Times New Roman" w:hAnsi="Times New Roman" w:cs="Times New Roman"/>
           <w:sz w:val="24"/>
-          <w:lang w:val="en-US"/>
         </w:rPr>
         <w:t xml:space="preserve">  </w:t>
       </w:r>
@@ -662,7 +489,6 @@
         <w:rPr>
           <w:rFonts w:ascii="Times New Roman" w:eastAsia="Times New Roman" w:hAnsi="Times New Roman" w:cs="Times New Roman"/>
           <w:sz w:val="24"/>
-          <w:lang w:val="en-US"/>
         </w:rPr>
         <w:tab/>
       </w:r>
@@ -670,27 +496,8 @@
         <w:rPr>
           <w:rFonts w:ascii="Times New Roman" w:hAnsi="Times New Roman"/>
           <w:szCs w:val="20"/>
-          <w:lang w:val="en-US"/>
-        </w:rPr>
-        <w:t>${</w:t>
-      </w:r>
-      <w:proofErr w:type="spellStart"/>
-      <w:r>
-        <w:rPr>
-          <w:rFonts w:ascii="Times New Roman" w:hAnsi="Times New Roman"/>
-          <w:szCs w:val="20"/>
-          <w:lang w:val="en-US"/>
-        </w:rPr>
-        <w:t>alamat_ktp</w:t>
-      </w:r>
-      <w:proofErr w:type="spellEnd"/>
-      <w:r>
-        <w:rPr>
-          <w:rFonts w:ascii="Times New Roman" w:hAnsi="Times New Roman"/>
-          <w:szCs w:val="20"/>
-          <w:lang w:val="en-US"/>
-        </w:rPr>
-        <w:t>}</w:t>
+        </w:rPr>
+        <w:t>${alamat_ktp}</w:t>
       </w:r>
     </w:p>
     <w:p>
@@ -772,7 +579,7 @@
           <w:rFonts w:ascii="Times New Roman" w:eastAsia="Times New Roman" w:hAnsi="Times New Roman" w:cs="Times New Roman"/>
           <w:b/>
           <w:sz w:val="24"/>
-          <w:lang w:val="en-US"/>
+          <w:lang w:val="sv-SE"/>
         </w:rPr>
       </w:pPr>
       <w:r>
@@ -813,29 +620,9 @@
           <w:rFonts w:ascii="Times New Roman" w:eastAsia="Times New Roman" w:hAnsi="Times New Roman" w:cs="Times New Roman"/>
           <w:b/>
           <w:sz w:val="24"/>
-          <w:lang w:val="en-US"/>
-        </w:rPr>
-        <w:t>${</w:t>
-      </w:r>
-      <w:proofErr w:type="spellStart"/>
-      <w:r>
-        <w:rPr>
-          <w:rFonts w:ascii="Times New Roman" w:eastAsia="Times New Roman" w:hAnsi="Times New Roman" w:cs="Times New Roman"/>
-          <w:b/>
-          <w:sz w:val="24"/>
-          <w:lang w:val="en-US"/>
-        </w:rPr>
-        <w:t>nama_perumahan</w:t>
-      </w:r>
-      <w:proofErr w:type="spellEnd"/>
-      <w:r>
-        <w:rPr>
-          <w:rFonts w:ascii="Times New Roman" w:eastAsia="Times New Roman" w:hAnsi="Times New Roman" w:cs="Times New Roman"/>
-          <w:b/>
-          <w:sz w:val="24"/>
-          <w:lang w:val="en-US"/>
-        </w:rPr>
-        <w:t>}</w:t>
+          <w:lang w:val="sv-SE"/>
+        </w:rPr>
+        <w:t>${nama_perumahan}</w:t>
       </w:r>
     </w:p>
     <w:p>
@@ -851,7 +638,7 @@
           <w:b/>
           <w:sz w:val="24"/>
           <w:szCs w:val="24"/>
-          <w:lang w:val="en-US"/>
+          <w:lang w:val="sv-SE"/>
         </w:rPr>
       </w:pPr>
       <w:r>
@@ -899,29 +686,9 @@
           <w:rFonts w:ascii="Times New Roman" w:eastAsia="Times New Roman" w:hAnsi="Times New Roman" w:cs="Times New Roman"/>
           <w:b/>
           <w:sz w:val="24"/>
-          <w:lang w:val="en-US"/>
-        </w:rPr>
-        <w:t>${</w:t>
-      </w:r>
-      <w:proofErr w:type="spellStart"/>
-      <w:r>
-        <w:rPr>
-          <w:rFonts w:ascii="Times New Roman" w:eastAsia="Times New Roman" w:hAnsi="Times New Roman" w:cs="Times New Roman"/>
-          <w:b/>
-          <w:sz w:val="24"/>
-          <w:lang w:val="en-US"/>
-        </w:rPr>
-        <w:t>kode_kavling</w:t>
-      </w:r>
-      <w:proofErr w:type="spellEnd"/>
-      <w:r>
-        <w:rPr>
-          <w:rFonts w:ascii="Times New Roman" w:eastAsia="Times New Roman" w:hAnsi="Times New Roman" w:cs="Times New Roman"/>
-          <w:b/>
-          <w:sz w:val="24"/>
-          <w:lang w:val="en-US"/>
-        </w:rPr>
-        <w:t>}</w:t>
+          <w:lang w:val="sv-SE"/>
+        </w:rPr>
+        <w:t>${kode_kavling}</w:t>
       </w:r>
     </w:p>
     <w:p>
@@ -932,7 +699,7 @@
           <w:b/>
           <w:sz w:val="24"/>
           <w:szCs w:val="24"/>
-          <w:lang w:val="en-US"/>
+          <w:lang w:val="sv-SE"/>
         </w:rPr>
       </w:pPr>
       <w:r>
@@ -1004,31 +771,9 @@
           <w:b/>
           <w:sz w:val="24"/>
           <w:szCs w:val="24"/>
-          <w:lang w:val="en-US"/>
-        </w:rPr>
-        <w:t>${</w:t>
-      </w:r>
-      <w:proofErr w:type="spellStart"/>
-      <w:r>
-        <w:rPr>
-          <w:rFonts w:ascii="Times New Roman" w:eastAsia="Calibri" w:hAnsi="Times New Roman" w:cs="Times New Roman"/>
-          <w:b/>
-          <w:sz w:val="24"/>
-          <w:szCs w:val="24"/>
-          <w:lang w:val="en-US"/>
-        </w:rPr>
-        <w:t>tipe_rumah</w:t>
-      </w:r>
-      <w:proofErr w:type="spellEnd"/>
-      <w:r>
-        <w:rPr>
-          <w:rFonts w:ascii="Times New Roman" w:eastAsia="Calibri" w:hAnsi="Times New Roman" w:cs="Times New Roman"/>
-          <w:b/>
-          <w:sz w:val="24"/>
-          <w:szCs w:val="24"/>
-          <w:lang w:val="en-US"/>
-        </w:rPr>
-        <w:t>}</w:t>
+          <w:lang w:val="sv-SE"/>
+        </w:rPr>
+        <w:t>${tipe_rumah}</w:t>
       </w:r>
     </w:p>
     <w:p>
@@ -1972,7 +1717,7 @@
 </file>
 
 <file path=word/endnotes.xml><?xml version="1.0" encoding="utf-8"?>
-<w:endnotes xmlns:wpc="http://schemas.microsoft.com/office/word/2010/wordprocessingCanvas" xmlns:cx="http://schemas.microsoft.com/office/drawing/2014/chartex" xmlns:cx1="http://schemas.microsoft.com/office/drawing/2015/9/8/chartex" xmlns:cx2="http://schemas.microsoft.com/office/drawing/2015/10/21/chartex" xmlns:cx3="http://schemas.microsoft.com/office/drawing/2016/5/9/chartex" xmlns:cx4="http://schemas.microsoft.com/office/drawing/2016/5/10/chartex" xmlns:cx5="http://schemas.microsoft.com/office/drawing/2016/5/11/chartex" xmlns:cx6="http://schemas.microsoft.com/office/drawing/2016/5/12/chartex" xmlns:cx7="http://schemas.microsoft.com/office/drawing/2016/5/13/chartex" xmlns:cx8="http://schemas.microsoft.com/office/drawing/2016/5/14/chartex" xmlns:mc="http://schemas.openxmlformats.org/markup-compatibility/2006" xmlns:aink="http://schemas.microsoft.com/office/drawing/2016/ink" xmlns:am3d="http://schemas.microsoft.com/office/drawing/2017/model3d" xmlns:o="urn:schemas-microsoft-com:office:office" xmlns:r="http://schemas.openxmlformats.org/officeDocument/2006/relationships" xmlns:m="http://schemas.openxmlformats.org/officeDocument/2006/math" xmlns:v="urn:schemas-microsoft-com:vml" xmlns:wp14="http://schemas.microsoft.com/office/word/2010/wordprocessingDrawing" xmlns:wp="http://schemas.openxmlformats.org/drawingml/2006/wordprocessingDrawing" xmlns:w10="urn:schemas-microsoft-com:office:word" xmlns:w="http://schemas.openxmlformats.org/wordprocessingml/2006/main" xmlns:w14="http://schemas.microsoft.com/office/word/2010/wordml" xmlns:w15="http://schemas.microsoft.com/office/word/2012/wordml" xmlns:w16cex="http://schemas.microsoft.com/office/word/2018/wordml/cex" xmlns:w16cid="http://schemas.microsoft.com/office/word/2016/wordml/cid" xmlns:w16="http://schemas.microsoft.com/office/word/2018/wordml" xmlns:w16sdtdh="http://schemas.microsoft.com/office/word/2020/wordml/sdtdatahash" xmlns:w16se="http://schemas.microsoft.com/office/word/2015/wordml/symex" xmlns:wpg="http://schemas.microsoft.com/office/word/2010/wordprocessingGroup" xmlns:wpi="http://schemas.microsoft.com/office/word/2010/wordprocessingInk" xmlns:wne="http://schemas.microsoft.com/office/word/2006/wordml" xmlns:wps="http://schemas.microsoft.com/office/word/2010/wordprocessingShape" mc:Ignorable="w14 w15 w16se w16cid w16 w16cex w16sdtdh wp14">
+<w:endnotes xmlns:wpc="http://schemas.microsoft.com/office/word/2010/wordprocessingCanvas" xmlns:cx="http://schemas.microsoft.com/office/drawing/2014/chartex" xmlns:cx1="http://schemas.microsoft.com/office/drawing/2015/9/8/chartex" xmlns:cx2="http://schemas.microsoft.com/office/drawing/2015/10/21/chartex" xmlns:cx3="http://schemas.microsoft.com/office/drawing/2016/5/9/chartex" xmlns:cx4="http://schemas.microsoft.com/office/drawing/2016/5/10/chartex" xmlns:cx5="http://schemas.microsoft.com/office/drawing/2016/5/11/chartex" xmlns:cx6="http://schemas.microsoft.com/office/drawing/2016/5/12/chartex" xmlns:cx7="http://schemas.microsoft.com/office/drawing/2016/5/13/chartex" xmlns:cx8="http://schemas.microsoft.com/office/drawing/2016/5/14/chartex" xmlns:mc="http://schemas.openxmlformats.org/markup-compatibility/2006" xmlns:aink="http://schemas.microsoft.com/office/drawing/2016/ink" xmlns:am3d="http://schemas.microsoft.com/office/drawing/2017/model3d" xmlns:o="urn:schemas-microsoft-com:office:office" xmlns:oel="http://schemas.microsoft.com/office/2019/extlst" xmlns:r="http://schemas.openxmlformats.org/officeDocument/2006/relationships" xmlns:m="http://schemas.openxmlformats.org/officeDocument/2006/math" xmlns:v="urn:schemas-microsoft-com:vml" xmlns:wp14="http://schemas.microsoft.com/office/word/2010/wordprocessingDrawing" xmlns:wp="http://schemas.openxmlformats.org/drawingml/2006/wordprocessingDrawing" xmlns:w10="urn:schemas-microsoft-com:office:word" xmlns:w="http://schemas.openxmlformats.org/wordprocessingml/2006/main" xmlns:w14="http://schemas.microsoft.com/office/word/2010/wordml" xmlns:w15="http://schemas.microsoft.com/office/word/2012/wordml" xmlns:w16cex="http://schemas.microsoft.com/office/word/2018/wordml/cex" xmlns:w16cid="http://schemas.microsoft.com/office/word/2016/wordml/cid" xmlns:w16="http://schemas.microsoft.com/office/word/2018/wordml" xmlns:w16sdtdh="http://schemas.microsoft.com/office/word/2020/wordml/sdtdatahash" xmlns:w16se="http://schemas.microsoft.com/office/word/2015/wordml/symex" xmlns:wpg="http://schemas.microsoft.com/office/word/2010/wordprocessingGroup" xmlns:wpi="http://schemas.microsoft.com/office/word/2010/wordprocessingInk" xmlns:wne="http://schemas.microsoft.com/office/word/2006/wordml" xmlns:wps="http://schemas.microsoft.com/office/word/2010/wordprocessingShape" mc:Ignorable="w14 w15 w16se w16cid w16 w16cex w16sdtdh wp14">
   <w:endnote w:type="separator" w:id="-1">
     <w:p>
       <w:pPr>
@@ -1997,7 +1742,7 @@
 </file>
 
 <file path=word/footnotes.xml><?xml version="1.0" encoding="utf-8"?>
-<w:footnotes xmlns:wpc="http://schemas.microsoft.com/office/word/2010/wordprocessingCanvas" xmlns:cx="http://schemas.microsoft.com/office/drawing/2014/chartex" xmlns:cx1="http://schemas.microsoft.com/office/drawing/2015/9/8/chartex" xmlns:cx2="http://schemas.microsoft.com/office/drawing/2015/10/21/chartex" xmlns:cx3="http://schemas.microsoft.com/office/drawing/2016/5/9/chartex" xmlns:cx4="http://schemas.microsoft.com/office/drawing/2016/5/10/chartex" xmlns:cx5="http://schemas.microsoft.com/office/drawing/2016/5/11/chartex" xmlns:cx6="http://schemas.microsoft.com/office/drawing/2016/5/12/chartex" xmlns:cx7="http://schemas.microsoft.com/office/drawing/2016/5/13/chartex" xmlns:cx8="http://schemas.microsoft.com/office/drawing/2016/5/14/chartex" xmlns:mc="http://schemas.openxmlformats.org/markup-compatibility/2006" xmlns:aink="http://schemas.microsoft.com/office/drawing/2016/ink" xmlns:am3d="http://schemas.microsoft.com/office/drawing/2017/model3d" xmlns:o="urn:schemas-microsoft-com:office:office" xmlns:r="http://schemas.openxmlformats.org/officeDocument/2006/relationships" xmlns:m="http://schemas.openxmlformats.org/officeDocument/2006/math" xmlns:v="urn:schemas-microsoft-com:vml" xmlns:wp14="http://schemas.microsoft.com/office/word/2010/wordprocessingDrawing" xmlns:wp="http://schemas.openxmlformats.org/drawingml/2006/wordprocessingDrawing" xmlns:w10="urn:schemas-microsoft-com:office:word" xmlns:w="http://schemas.openxmlformats.org/wordprocessingml/2006/main" xmlns:w14="http://schemas.microsoft.com/office/word/2010/wordml" xmlns:w15="http://schemas.microsoft.com/office/word/2012/wordml" xmlns:w16cex="http://schemas.microsoft.com/office/word/2018/wordml/cex" xmlns:w16cid="http://schemas.microsoft.com/office/word/2016/wordml/cid" xmlns:w16="http://schemas.microsoft.com/office/word/2018/wordml" xmlns:w16sdtdh="http://schemas.microsoft.com/office/word/2020/wordml/sdtdatahash" xmlns:w16se="http://schemas.microsoft.com/office/word/2015/wordml/symex" xmlns:wpg="http://schemas.microsoft.com/office/word/2010/wordprocessingGroup" xmlns:wpi="http://schemas.microsoft.com/office/word/2010/wordprocessingInk" xmlns:wne="http://schemas.microsoft.com/office/word/2006/wordml" xmlns:wps="http://schemas.microsoft.com/office/word/2010/wordprocessingShape" mc:Ignorable="w14 w15 w16se w16cid w16 w16cex w16sdtdh wp14">
+<w:footnotes xmlns:wpc="http://schemas.microsoft.com/office/word/2010/wordprocessingCanvas" xmlns:cx="http://schemas.microsoft.com/office/drawing/2014/chartex" xmlns:cx1="http://schemas.microsoft.com/office/drawing/2015/9/8/chartex" xmlns:cx2="http://schemas.microsoft.com/office/drawing/2015/10/21/chartex" xmlns:cx3="http://schemas.microsoft.com/office/drawing/2016/5/9/chartex" xmlns:cx4="http://schemas.microsoft.com/office/drawing/2016/5/10/chartex" xmlns:cx5="http://schemas.microsoft.com/office/drawing/2016/5/11/chartex" xmlns:cx6="http://schemas.microsoft.com/office/drawing/2016/5/12/chartex" xmlns:cx7="http://schemas.microsoft.com/office/drawing/2016/5/13/chartex" xmlns:cx8="http://schemas.microsoft.com/office/drawing/2016/5/14/chartex" xmlns:mc="http://schemas.openxmlformats.org/markup-compatibility/2006" xmlns:aink="http://schemas.microsoft.com/office/drawing/2016/ink" xmlns:am3d="http://schemas.microsoft.com/office/drawing/2017/model3d" xmlns:o="urn:schemas-microsoft-com:office:office" xmlns:oel="http://schemas.microsoft.com/office/2019/extlst" xmlns:r="http://schemas.openxmlformats.org/officeDocument/2006/relationships" xmlns:m="http://schemas.openxmlformats.org/officeDocument/2006/math" xmlns:v="urn:schemas-microsoft-com:vml" xmlns:wp14="http://schemas.microsoft.com/office/word/2010/wordprocessingDrawing" xmlns:wp="http://schemas.openxmlformats.org/drawingml/2006/wordprocessingDrawing" xmlns:w10="urn:schemas-microsoft-com:office:word" xmlns:w="http://schemas.openxmlformats.org/wordprocessingml/2006/main" xmlns:w14="http://schemas.microsoft.com/office/word/2010/wordml" xmlns:w15="http://schemas.microsoft.com/office/word/2012/wordml" xmlns:w16cex="http://schemas.microsoft.com/office/word/2018/wordml/cex" xmlns:w16cid="http://schemas.microsoft.com/office/word/2016/wordml/cid" xmlns:w16="http://schemas.microsoft.com/office/word/2018/wordml" xmlns:w16sdtdh="http://schemas.microsoft.com/office/word/2020/wordml/sdtdatahash" xmlns:w16se="http://schemas.microsoft.com/office/word/2015/wordml/symex" xmlns:wpg="http://schemas.microsoft.com/office/word/2010/wordprocessingGroup" xmlns:wpi="http://schemas.microsoft.com/office/word/2010/wordprocessingInk" xmlns:wne="http://schemas.microsoft.com/office/word/2006/wordml" xmlns:wps="http://schemas.microsoft.com/office/word/2010/wordprocessingShape" mc:Ignorable="w14 w15 w16se w16cid w16 w16cex w16sdtdh wp14">
   <w:footnote w:type="separator" w:id="-1">
     <w:p>
       <w:pPr>

</xml_diff>